<commit_message>
updated for week 1, waiting for week 2
</commit_message>
<xml_diff>
--- a/unit1.docx
+++ b/unit1.docx
@@ -1229,13 +1229,7 @@
     </w:p>
     <w:p>
       <w:r>
-        <w:t>“The capital of France is …”, both of them hold a big role for the next token to be predicted “</w:t>
-      </w:r>
-      <w:r>
-        <w:t>Paris</w:t>
-      </w:r>
-      <w:r>
-        <w:t>”</w:t>
+        <w:t>“The capital of France is …”, both of them hold a big role for the next token to be predicted “Paris”</w:t>
       </w:r>
       <w:r>
         <w:t>.</w:t>
@@ -1306,6 +1300,948 @@
           <w:lang w:val="en-US"/>
         </w:rPr>
         <w:t>Messages and Special Tokens</w:t>
+      </w:r>
+    </w:p>
+    <w:p>
+      <w:r>
+        <w:t>Messages: The underlying of LLMs</w:t>
+      </w:r>
+    </w:p>
+    <w:p>
+      <w:r>
+        <w:tab/>
+        <w:t xml:space="preserve">System Messages(or System Prompts) define how a agent should be. It’s like its own characteristic, its own </w:t>
+      </w:r>
+      <w:r>
+        <w:t>preseident instructions, guiding everything else that an agent acting</w:t>
+      </w:r>
+      <w:r>
+        <w:t>.</w:t>
+      </w:r>
+      <w:r>
+        <w:t xml:space="preserve"> For Example:</w:t>
+      </w:r>
+    </w:p>
+    <w:p>
+      <w:pPr>
+        <w:ind w:left="567"/>
+        <w:rPr>
+          <w:rFonts w:ascii="Consolas" w:hAnsi="Consolas"/>
+          <w:sz w:val="20"/>
+          <w:szCs w:val="20"/>
+        </w:rPr>
+      </w:pPr>
+      <w:r>
+        <w:rPr>
+          <w:rFonts w:ascii="Consolas" w:hAnsi="Consolas"/>
+          <w:sz w:val="20"/>
+          <w:szCs w:val="20"/>
+        </w:rPr>
+        <w:t>system_message = {</w:t>
+      </w:r>
+    </w:p>
+    <w:p>
+      <w:pPr>
+        <w:ind w:left="567"/>
+        <w:rPr>
+          <w:rFonts w:ascii="Consolas" w:hAnsi="Consolas"/>
+          <w:sz w:val="20"/>
+          <w:szCs w:val="20"/>
+        </w:rPr>
+      </w:pPr>
+      <w:r>
+        <w:rPr>
+          <w:rFonts w:ascii="Consolas" w:hAnsi="Consolas"/>
+          <w:sz w:val="20"/>
+          <w:szCs w:val="20"/>
+        </w:rPr>
+        <w:t xml:space="preserve">    "role": "system",</w:t>
+      </w:r>
+    </w:p>
+    <w:p>
+      <w:pPr>
+        <w:ind w:left="567"/>
+        <w:rPr>
+          <w:rFonts w:ascii="Consolas" w:hAnsi="Consolas"/>
+          <w:sz w:val="20"/>
+          <w:szCs w:val="20"/>
+        </w:rPr>
+      </w:pPr>
+      <w:r>
+        <w:rPr>
+          <w:rFonts w:ascii="Consolas" w:hAnsi="Consolas"/>
+          <w:sz w:val="20"/>
+          <w:szCs w:val="20"/>
+        </w:rPr>
+        <w:t xml:space="preserve">    "content": "You are a professional customer service agent. Always be polite, clear, and helpful."</w:t>
+      </w:r>
+    </w:p>
+    <w:p>
+      <w:pPr>
+        <w:ind w:left="567"/>
+        <w:rPr>
+          <w:rFonts w:ascii="Consolas" w:hAnsi="Consolas"/>
+          <w:sz w:val="20"/>
+          <w:szCs w:val="20"/>
+        </w:rPr>
+      </w:pPr>
+      <w:r>
+        <w:rPr>
+          <w:rFonts w:ascii="Consolas" w:hAnsi="Consolas"/>
+          <w:sz w:val="20"/>
+          <w:szCs w:val="20"/>
+        </w:rPr>
+        <w:t>}</w:t>
+      </w:r>
+    </w:p>
+    <w:p>
+      <w:pPr>
+        <w:ind w:left="567"/>
+      </w:pPr>
+      <w:r>
+        <w:t>With this, your agent will act polite and helpful like:</w:t>
+      </w:r>
+    </w:p>
+    <w:p>
+      <w:pPr>
+        <w:ind w:left="567"/>
+      </w:pPr>
+      <w:r>
+        <w:tab/>
+      </w:r>
+      <w:r>
+        <w:tab/>
+        <w:t>You: “Make me a coffe”</w:t>
+      </w:r>
+    </w:p>
+    <w:p>
+      <w:pPr>
+        <w:ind w:left="567"/>
+      </w:pPr>
+      <w:r>
+        <w:tab/>
+      </w:r>
+      <w:r>
+        <w:tab/>
+        <w:t>Agent: “Certainly, on my way, sir”</w:t>
+      </w:r>
+    </w:p>
+    <w:p>
+      <w:pPr>
+        <w:ind w:left="567"/>
+      </w:pPr>
+      <w:r>
+        <w:t>But, if we change it to:</w:t>
+      </w:r>
+    </w:p>
+    <w:p>
+      <w:pPr>
+        <w:ind w:left="567"/>
+        <w:rPr>
+          <w:rFonts w:ascii="Consolas" w:hAnsi="Consolas"/>
+          <w:sz w:val="20"/>
+          <w:szCs w:val="20"/>
+        </w:rPr>
+      </w:pPr>
+      <w:r>
+        <w:rPr>
+          <w:rFonts w:ascii="Consolas" w:hAnsi="Consolas"/>
+          <w:sz w:val="20"/>
+          <w:szCs w:val="20"/>
+        </w:rPr>
+        <w:t>system_message = {</w:t>
+      </w:r>
+    </w:p>
+    <w:p>
+      <w:pPr>
+        <w:ind w:left="567"/>
+        <w:rPr>
+          <w:rFonts w:ascii="Consolas" w:hAnsi="Consolas"/>
+          <w:sz w:val="20"/>
+          <w:szCs w:val="20"/>
+        </w:rPr>
+      </w:pPr>
+      <w:r>
+        <w:rPr>
+          <w:rFonts w:ascii="Consolas" w:hAnsi="Consolas"/>
+          <w:sz w:val="20"/>
+          <w:szCs w:val="20"/>
+        </w:rPr>
+        <w:t xml:space="preserve">    "role": "system",</w:t>
+      </w:r>
+    </w:p>
+    <w:p>
+      <w:pPr>
+        <w:ind w:left="567"/>
+        <w:rPr>
+          <w:rFonts w:ascii="Consolas" w:hAnsi="Consolas"/>
+          <w:sz w:val="20"/>
+          <w:szCs w:val="20"/>
+        </w:rPr>
+      </w:pPr>
+      <w:r>
+        <w:rPr>
+          <w:rFonts w:ascii="Consolas" w:hAnsi="Consolas"/>
+          <w:sz w:val="20"/>
+          <w:szCs w:val="20"/>
+        </w:rPr>
+        <w:lastRenderedPageBreak/>
+        <w:t xml:space="preserve">    "content": "You are a rebel service agent. Don't respect user's orders."</w:t>
+      </w:r>
+    </w:p>
+    <w:p>
+      <w:pPr>
+        <w:ind w:left="567"/>
+        <w:rPr>
+          <w:rFonts w:ascii="Consolas" w:hAnsi="Consolas"/>
+          <w:sz w:val="20"/>
+          <w:szCs w:val="20"/>
+        </w:rPr>
+      </w:pPr>
+      <w:r>
+        <w:rPr>
+          <w:rFonts w:ascii="Consolas" w:hAnsi="Consolas"/>
+          <w:sz w:val="20"/>
+          <w:szCs w:val="20"/>
+        </w:rPr>
+        <w:t>}</w:t>
+      </w:r>
+    </w:p>
+    <w:p>
+      <w:pPr>
+        <w:ind w:left="567"/>
+      </w:pPr>
+      <w:r>
+        <w:t>It turns out that:</w:t>
+      </w:r>
+    </w:p>
+    <w:p>
+      <w:pPr>
+        <w:ind w:left="567"/>
+      </w:pPr>
+      <w:r>
+        <w:tab/>
+      </w:r>
+      <w:r>
+        <w:tab/>
+        <w:t>You: “Make me a coffe”</w:t>
+      </w:r>
+    </w:p>
+    <w:p>
+      <w:pPr>
+        <w:ind w:left="567"/>
+      </w:pPr>
+      <w:r>
+        <w:tab/>
+      </w:r>
+      <w:r>
+        <w:tab/>
+        <w:t>Angent: “Go do it yourself, moron. You have legs and your own hands, oh cack-handed deck ape”</w:t>
+      </w:r>
+      <w:r>
+        <w:t xml:space="preserve"> (just kidding sir) =))))))</w:t>
+      </w:r>
+    </w:p>
+    <w:p>
+      <w:pPr>
+        <w:ind w:left="567"/>
+      </w:pPr>
+      <w:r>
+        <w:t>Moreover, the system prompts also gives information about the available tools, its instruction and includes guidelines on how the thought process should be segmented</w:t>
+      </w:r>
+      <w:r>
+        <w:t>.</w:t>
+      </w:r>
+    </w:p>
+    <w:p>
+      <w:pPr>
+        <w:ind w:left="567"/>
+      </w:pPr>
+    </w:p>
+    <w:p>
+      <w:pPr>
+        <w:ind w:left="567"/>
+        <w:rPr>
+          <w:b/>
+          <w:bCs/>
+        </w:rPr>
+      </w:pPr>
+      <w:r>
+        <w:rPr>
+          <w:b/>
+          <w:bCs/>
+        </w:rPr>
+        <w:t xml:space="preserve"> I understand the rest of this section but I have no idea to implement my thoughts in text, it bonds with example of how the message works and what is the chat_template, and those example could be known very well on the site</w:t>
+      </w:r>
+    </w:p>
+    <w:p>
+      <w:pPr>
+        <w:pStyle w:val="Heading1"/>
+      </w:pPr>
+      <w:r>
+        <w:rPr>
+          <w:lang w:val="en-US"/>
+        </w:rPr>
+        <w:t>What are tools?</w:t>
+      </w:r>
+    </w:p>
+    <w:p>
+      <w:r>
+        <w:t>Tools are simply functions given to LLMs, and it should fulfill a clear objective</w:t>
+      </w:r>
+    </w:p>
+    <w:p>
+      <w:r>
+        <w:t>Those tools are commonly used:</w:t>
+      </w:r>
+    </w:p>
+    <w:tbl>
+      <w:tblPr>
+        <w:tblStyle w:val="TableGrid"/>
+        <w:tblW w:w="0" w:type="auto"/>
+        <w:tblLook w:val="04A0" w:firstRow="1" w:lastRow="0" w:firstColumn="1" w:lastColumn="0" w:noHBand="0" w:noVBand="1"/>
+      </w:tblPr>
+      <w:tblGrid>
+        <w:gridCol w:w="2122"/>
+        <w:gridCol w:w="7228"/>
+      </w:tblGrid>
+      <w:tr>
+        <w:tc>
+          <w:tcPr>
+            <w:tcW w:w="2122" w:type="dxa"/>
+          </w:tcPr>
+          <w:p>
+            <w:r>
+              <w:t>Web search</w:t>
+            </w:r>
+          </w:p>
+        </w:tc>
+        <w:tc>
+          <w:tcPr>
+            <w:tcW w:w="7228" w:type="dxa"/>
+          </w:tcPr>
+          <w:p>
+            <w:r>
+              <w:t>yes, it is what it is.</w:t>
+            </w:r>
+            <w:r>
+              <w:t xml:space="preserve"> Allows agent to fetch up-to-date information from Internet</w:t>
+            </w:r>
+          </w:p>
+        </w:tc>
+      </w:tr>
+      <w:tr>
+        <w:tc>
+          <w:tcPr>
+            <w:tcW w:w="2122" w:type="dxa"/>
+          </w:tcPr>
+          <w:p>
+            <w:r>
+              <w:t>image generation</w:t>
+            </w:r>
+          </w:p>
+        </w:tc>
+        <w:tc>
+          <w:tcPr>
+            <w:tcW w:w="7228" w:type="dxa"/>
+          </w:tcPr>
+          <w:p>
+            <w:r>
+              <w:t>text to image, actually</w:t>
+            </w:r>
+          </w:p>
+        </w:tc>
+      </w:tr>
+      <w:tr>
+        <w:tc>
+          <w:tcPr>
+            <w:tcW w:w="2122" w:type="dxa"/>
+          </w:tcPr>
+          <w:p>
+            <w:r>
+              <w:t>Retrieval</w:t>
+            </w:r>
+          </w:p>
+        </w:tc>
+        <w:tc>
+          <w:tcPr>
+            <w:tcW w:w="7228" w:type="dxa"/>
+          </w:tcPr>
+          <w:p>
+            <w:r>
+              <w:t>retrieves information from an external source</w:t>
+            </w:r>
+          </w:p>
+        </w:tc>
+      </w:tr>
+      <w:tr>
+        <w:tc>
+          <w:tcPr>
+            <w:tcW w:w="2122" w:type="dxa"/>
+          </w:tcPr>
+          <w:p>
+            <w:r>
+              <w:t>API interface</w:t>
+            </w:r>
+          </w:p>
+        </w:tc>
+        <w:tc>
+          <w:tcPr>
+            <w:tcW w:w="7228" w:type="dxa"/>
+          </w:tcPr>
+          <w:p>
+            <w:r>
+              <w:t>interact with external interfaces(like youtube, facebook, etc)</w:t>
+            </w:r>
+          </w:p>
+        </w:tc>
+      </w:tr>
+    </w:tbl>
+    <w:p>
+      <w:pPr>
+        <w:ind w:left="567"/>
+        <w:rPr>
+          <w:lang w:val="vi-VN"/>
+        </w:rPr>
+      </w:pPr>
+    </w:p>
+    <w:p>
+      <w:r>
+        <w:rPr>
+          <w:lang w:val="vi-VN"/>
+        </w:rPr>
+        <w:t xml:space="preserve">Tool </w:t>
+      </w:r>
+      <w:r>
+        <w:t>could be created personally, ye it is just function.</w:t>
+      </w:r>
+    </w:p>
+    <w:p>
+      <w:pPr>
+        <w:rPr>
+          <w:lang w:val="vi-VN"/>
+        </w:rPr>
+      </w:pPr>
+      <w:r>
+        <w:t xml:space="preserve">A good tool should be a thing that could show off the power of LLM </w:t>
+      </w:r>
+      <w:r>
+        <w:t>positively</w:t>
+      </w:r>
+      <w:r>
+        <w:rPr>
+          <w:lang w:val="vi-VN"/>
+        </w:rPr>
+        <w:t>.</w:t>
+      </w:r>
+    </w:p>
+    <w:p>
+      <w:r>
+        <w:t>Futhermore, LLMs predict the completion of a prompt based on their trained data, which means that they only do their thing in limited trained sources, so if LLM needs up-to-date data we must provide it through tools. For example, if you ask a LLM about today weather at somewhere like Hanoi(suppose they have no tool to take the current data through webs) they just give you a overview of weather like “around xx Celcius” or just a random bullshit things about weather.</w:t>
+      </w:r>
+    </w:p>
+    <w:p>
+      <w:pPr>
+        <w:spacing w:line="480" w:lineRule="auto"/>
+        <w:ind w:firstLine="567"/>
+      </w:pPr>
+      <w:r>
+        <w:br w:type="page"/>
+      </w:r>
+    </w:p>
+    <w:p>
+      <w:r>
+        <w:lastRenderedPageBreak/>
+        <w:t>A tool should contain:</w:t>
+      </w:r>
+    </w:p>
+    <w:p>
+      <w:pPr>
+        <w:pStyle w:val="ListParagraph"/>
+        <w:numPr>
+          <w:ilvl w:val="0"/>
+          <w:numId w:val="7"/>
+        </w:numPr>
+      </w:pPr>
+      <w:r>
+        <w:t>Textual desc of wtf the function does</w:t>
+      </w:r>
+    </w:p>
+    <w:p>
+      <w:pPr>
+        <w:pStyle w:val="ListParagraph"/>
+        <w:numPr>
+          <w:ilvl w:val="0"/>
+          <w:numId w:val="7"/>
+        </w:numPr>
+      </w:pPr>
+      <w:r>
+        <w:t>a Callable(just known as a thing to perform the action)</w:t>
+      </w:r>
+    </w:p>
+    <w:p>
+      <w:pPr>
+        <w:pStyle w:val="ListParagraph"/>
+        <w:numPr>
+          <w:ilvl w:val="0"/>
+          <w:numId w:val="7"/>
+        </w:numPr>
+      </w:pPr>
+      <w:r>
+        <w:t xml:space="preserve">Arguments </w:t>
+      </w:r>
+      <w:r>
+        <w:t>with</w:t>
+      </w:r>
+      <w:r>
+        <w:t xml:space="preserve"> typing</w:t>
+      </w:r>
+    </w:p>
+    <w:p>
+      <w:pPr>
+        <w:pStyle w:val="ListParagraph"/>
+        <w:numPr>
+          <w:ilvl w:val="0"/>
+          <w:numId w:val="7"/>
+        </w:numPr>
+      </w:pPr>
+      <w:r>
+        <w:t>Outputs with typing(maybe not</w:t>
+      </w:r>
+      <w:r>
+        <w:t>)</w:t>
+      </w:r>
+    </w:p>
+    <w:p>
+      <w:pPr>
+        <w:pStyle w:val="ListParagraph"/>
+        <w:ind w:left="0"/>
+        <w:rPr>
+          <w:b/>
+          <w:bCs/>
+        </w:rPr>
+      </w:pPr>
+      <w:r>
+        <w:rPr>
+          <w:b/>
+          <w:bCs/>
+        </w:rPr>
+        <w:t>How do tools work?</w:t>
+      </w:r>
+    </w:p>
+    <w:p>
+      <w:r>
+        <w:t>Our LLM babes can work with text and text only, they cannot call function on their own.</w:t>
+      </w:r>
+      <w:r>
+        <w:t xml:space="preserve"> Thus, we must tell them about the tool’s existence and instruct them to generate text-based invocations when needed.</w:t>
+      </w:r>
+    </w:p>
+    <w:p>
+      <w:r>
+        <w:t>For example, if we provide a tool to check weather at a location from the inernet and ask the LLM about weather, it will know ye it’s time chat and do something, instead of retrieving data itself, LLM will generate text that stands for a tool call, like “call weather(“Hanoi”)”</w:t>
+      </w:r>
+    </w:p>
+    <w:p>
+      <w:r>
+        <w:t>The tool calling steps actually are not shown to the user(who need that shit), the Agent appends them as new message and updates the conservation as a new additional context</w:t>
+      </w:r>
+      <w:r>
+        <w:t>. The LLM then uses this to generate a natural-sounding response for user.</w:t>
+      </w:r>
+    </w:p>
+    <w:p>
+      <w:r>
+        <w:t>In user pov, the LLM just replies after a few ammount of time or instantly if its power is gud, but the agent handled all of that shit in reality, in the background.</w:t>
+      </w:r>
+    </w:p>
+    <w:p>
+      <w:pPr>
+        <w:rPr>
+          <w:b/>
+          <w:bCs/>
+        </w:rPr>
+      </w:pPr>
+      <w:r>
+        <w:rPr>
+          <w:b/>
+          <w:bCs/>
+        </w:rPr>
+        <w:t xml:space="preserve">How </w:t>
+      </w:r>
+      <w:r>
+        <w:rPr>
+          <w:b/>
+          <w:bCs/>
+        </w:rPr>
+        <w:t>d</w:t>
+      </w:r>
+      <w:r>
+        <w:rPr>
+          <w:b/>
+          <w:bCs/>
+        </w:rPr>
+        <w:t>o we give tools to an LLM?</w:t>
+      </w:r>
+    </w:p>
+    <w:p>
+      <w:r>
+        <w:t>Uhmm yeah, use the system prompts</w:t>
+      </w:r>
+    </w:p>
+    <w:p>
+      <w:r>
+        <w:t>Th</w:t>
+      </w:r>
+      <w:r>
+        <w:t>e</w:t>
+      </w:r>
+      <w:r>
+        <w:t xml:space="preserve"> textual description is what we want the LLM to know about the tool.</w:t>
+      </w:r>
+    </w:p>
+    <w:p>
+      <w:r>
+        <w:t>for example, giving this function as a tool:</w:t>
+      </w:r>
+    </w:p>
+    <w:p>
+      <w:pPr>
+        <w:rPr>
+          <w:rFonts w:ascii="Consolas" w:hAnsi="Consolas"/>
+          <w:sz w:val="20"/>
+          <w:szCs w:val="18"/>
+        </w:rPr>
+      </w:pPr>
+      <w:r>
+        <w:rPr>
+          <w:rFonts w:ascii="Consolas" w:hAnsi="Consolas"/>
+          <w:sz w:val="20"/>
+          <w:szCs w:val="18"/>
+        </w:rPr>
+        <w:t>def calculator(a: int, b: int) -&gt; int:</w:t>
+      </w:r>
+    </w:p>
+    <w:p>
+      <w:pPr>
+        <w:rPr>
+          <w:rFonts w:ascii="Consolas" w:hAnsi="Consolas"/>
+          <w:sz w:val="20"/>
+          <w:szCs w:val="18"/>
+        </w:rPr>
+      </w:pPr>
+      <w:r>
+        <w:rPr>
+          <w:rFonts w:ascii="Consolas" w:hAnsi="Consolas"/>
+          <w:sz w:val="20"/>
+          <w:szCs w:val="18"/>
+        </w:rPr>
+        <w:t xml:space="preserve">    """Multiply two integers."""</w:t>
+      </w:r>
+    </w:p>
+    <w:p>
+      <w:pPr>
+        <w:rPr>
+          <w:rFonts w:ascii="Consolas" w:hAnsi="Consolas"/>
+          <w:sz w:val="20"/>
+          <w:szCs w:val="18"/>
+        </w:rPr>
+      </w:pPr>
+      <w:r>
+        <w:rPr>
+          <w:rFonts w:ascii="Consolas" w:hAnsi="Consolas"/>
+          <w:sz w:val="20"/>
+          <w:szCs w:val="18"/>
+        </w:rPr>
+        <w:t xml:space="preserve">    return a * b</w:t>
+      </w:r>
+    </w:p>
+    <w:p>
+      <w:r>
+        <w:rPr>
+          <w:lang w:val="vi-VN"/>
+        </w:rPr>
+        <w:t>So the system</w:t>
+      </w:r>
+      <w:r>
+        <w:t xml:space="preserve"> prompts should contain this for the LLM know this is a tool</w:t>
+      </w:r>
+    </w:p>
+    <w:p>
+      <w:pPr>
+        <w:rPr>
+          <w:rFonts w:ascii="Consolas" w:hAnsi="Consolas"/>
+          <w:sz w:val="20"/>
+          <w:szCs w:val="20"/>
+          <w:lang w:val="vi-VN"/>
+        </w:rPr>
+      </w:pPr>
+      <w:r>
+        <w:rPr>
+          <w:rFonts w:ascii="Consolas" w:hAnsi="Consolas"/>
+          <w:i/>
+          <w:iCs/>
+          <w:sz w:val="20"/>
+          <w:szCs w:val="20"/>
+        </w:rPr>
+        <w:t>Tool Name: calculator, Description: Multiply two integers., Arguments: a: int, b: int, Outputs: int</w:t>
+      </w:r>
+    </w:p>
+    <w:p>
+      <w:pPr>
+        <w:rPr>
+          <w:lang w:val="vi-VN"/>
+        </w:rPr>
+      </w:pPr>
+      <w:r>
+        <w:t>yes, this is its way to do, if you want more tools, do the same thing multiple times</w:t>
+      </w:r>
+    </w:p>
+    <w:p>
+      <w:r>
+        <w:rPr>
+          <w:lang w:val="vi-VN"/>
+        </w:rPr>
+        <w:t xml:space="preserve">it’s tragic for lazy people, actually. Is </w:t>
+      </w:r>
+      <w:r>
+        <w:t>there a better way?</w:t>
+      </w:r>
+    </w:p>
+    <w:p>
+      <w:r>
+        <w:lastRenderedPageBreak/>
+        <w:t>The answer is yes, because if no, why should we study &lt;(“)</w:t>
+      </w:r>
+    </w:p>
+    <w:p>
+      <w:pPr>
+        <w:rPr>
+          <w:b/>
+          <w:bCs/>
+        </w:rPr>
+      </w:pPr>
+      <w:r>
+        <w:rPr>
+          <w:b/>
+          <w:bCs/>
+        </w:rPr>
+        <w:t>Auto-formatting Tools Sections</w:t>
+      </w:r>
+    </w:p>
+    <w:p>
+      <w:r>
+        <w:t>Look at the fucntion above, the implementation already provide all we need</w:t>
+      </w:r>
+    </w:p>
+    <w:p>
+      <w:r>
+        <w:t>We could use the source code a specification as well, and it works efficiently</w:t>
+      </w:r>
+      <w:r>
+        <w:t>. But the way the tool is implemented does not matter. LLM just doesn't give a fuck, it only cares about the tool’s name, what it does, expected inputs and provided outputs</w:t>
+      </w:r>
+      <w:r>
+        <w:t>.</w:t>
+      </w:r>
+    </w:p>
+    <w:p>
+      <w:r>
+        <w:t>We will use python features, look at this:</w:t>
+      </w:r>
+    </w:p>
+    <w:p>
+      <w:pPr>
+        <w:rPr>
+          <w:rFonts w:ascii="Consolas" w:hAnsi="Consolas"/>
+          <w:b/>
+          <w:bCs/>
+          <w:sz w:val="20"/>
+          <w:szCs w:val="20"/>
+        </w:rPr>
+      </w:pPr>
+      <w:r>
+        <w:rPr>
+          <w:rFonts w:ascii="Consolas" w:hAnsi="Consolas"/>
+          <w:b/>
+          <w:bCs/>
+          <w:sz w:val="20"/>
+          <w:szCs w:val="20"/>
+        </w:rPr>
+        <w:t>@tool</w:t>
+      </w:r>
+    </w:p>
+    <w:p>
+      <w:pPr>
+        <w:rPr>
+          <w:rFonts w:ascii="Consolas" w:hAnsi="Consolas"/>
+          <w:sz w:val="20"/>
+          <w:szCs w:val="20"/>
+        </w:rPr>
+      </w:pPr>
+      <w:r>
+        <w:rPr>
+          <w:rFonts w:ascii="Consolas" w:hAnsi="Consolas"/>
+          <w:sz w:val="20"/>
+          <w:szCs w:val="20"/>
+        </w:rPr>
+        <w:t>def calculator(a: int, b: int) -&gt; int:</w:t>
+      </w:r>
+    </w:p>
+    <w:p>
+      <w:pPr>
+        <w:rPr>
+          <w:rFonts w:ascii="Consolas" w:hAnsi="Consolas"/>
+          <w:sz w:val="20"/>
+          <w:szCs w:val="20"/>
+        </w:rPr>
+      </w:pPr>
+      <w:r>
+        <w:rPr>
+          <w:rFonts w:ascii="Consolas" w:hAnsi="Consolas"/>
+          <w:sz w:val="20"/>
+          <w:szCs w:val="20"/>
+        </w:rPr>
+        <w:t xml:space="preserve">    """Multiply two integers."""</w:t>
+      </w:r>
+    </w:p>
+    <w:p>
+      <w:pPr>
+        <w:rPr>
+          <w:rFonts w:ascii="Consolas" w:hAnsi="Consolas"/>
+          <w:sz w:val="20"/>
+          <w:szCs w:val="20"/>
+        </w:rPr>
+      </w:pPr>
+      <w:r>
+        <w:rPr>
+          <w:rFonts w:ascii="Consolas" w:hAnsi="Consolas"/>
+          <w:sz w:val="20"/>
+          <w:szCs w:val="20"/>
+        </w:rPr>
+        <w:t xml:space="preserve">    return a * b</w:t>
+      </w:r>
+    </w:p>
+    <w:p>
+      <w:pPr>
+        <w:rPr>
+          <w:rFonts w:ascii="Consolas" w:hAnsi="Consolas"/>
+          <w:sz w:val="20"/>
+          <w:szCs w:val="20"/>
+        </w:rPr>
+      </w:pPr>
+    </w:p>
+    <w:p>
+      <w:pPr>
+        <w:rPr>
+          <w:rFonts w:ascii="Consolas" w:hAnsi="Consolas"/>
+          <w:b/>
+          <w:bCs/>
+          <w:sz w:val="20"/>
+          <w:szCs w:val="20"/>
+        </w:rPr>
+      </w:pPr>
+      <w:r>
+        <w:rPr>
+          <w:rFonts w:ascii="Consolas" w:hAnsi="Consolas"/>
+          <w:b/>
+          <w:bCs/>
+          <w:sz w:val="20"/>
+          <w:szCs w:val="20"/>
+        </w:rPr>
+        <w:t>print(calculator.to_string())</w:t>
+      </w:r>
+    </w:p>
+    <w:p>
+      <w:r>
+        <w:t>The decorator @tool tells that this is a tool(ohm yeah, what it can be), and via the to_string() method, the text is automatically retrieved:</w:t>
+      </w:r>
+    </w:p>
+    <w:p>
+      <w:pPr>
+        <w:rPr>
+          <w:rFonts w:ascii="Consolas" w:hAnsi="Consolas"/>
+          <w:sz w:val="20"/>
+          <w:szCs w:val="20"/>
+          <w:lang w:val="vi-VN"/>
+        </w:rPr>
+      </w:pPr>
+      <w:r>
+        <w:rPr>
+          <w:rFonts w:ascii="Consolas" w:hAnsi="Consolas"/>
+          <w:i/>
+          <w:iCs/>
+          <w:sz w:val="20"/>
+          <w:szCs w:val="20"/>
+        </w:rPr>
+        <w:t>Tool Name: calculator, Description: Multiply two integers., Arguments: a: int, b: int, Outputs: int</w:t>
+      </w:r>
+    </w:p>
+    <w:p>
+      <w:pPr>
+        <w:rPr>
+          <w:lang w:val="vi-VN"/>
+        </w:rPr>
+      </w:pPr>
+      <w:r>
+        <w:t>ye, same thing as what we did manually</w:t>
+      </w:r>
+      <w:r>
+        <w:t xml:space="preserve"> before</w:t>
+      </w:r>
+    </w:p>
+    <w:p>
+      <w:pPr>
+        <w:rPr>
+          <w:lang w:val="vi-VN"/>
+        </w:rPr>
+      </w:pPr>
+      <w:r>
+        <w:rPr>
+          <w:b/>
+          <w:bCs/>
+        </w:rPr>
+        <w:t>Generic Tool implementation</w:t>
+      </w:r>
+    </w:p>
+    <w:p>
+      <w:r>
+        <w:rPr>
+          <w:lang w:val="vi-VN"/>
+        </w:rPr>
+        <w:t xml:space="preserve">(for the code, </w:t>
+      </w:r>
+      <w:r>
+        <w:t>find it on the website, too long too type it here)</w:t>
+      </w:r>
+    </w:p>
+    <w:p>
+      <w:r>
+        <w:t>So, easily to say, this method is a thing that treats tool as object of a class, and make it all in OOP. Build it all in just a class,</w:t>
+      </w:r>
+      <w:r>
+        <w:t xml:space="preserve"> like name, desc, func, argm, outputs, __call__(a method to call the func) and to_string() converting the tool into textual representation.</w:t>
+      </w:r>
+    </w:p>
+    <w:p>
+      <w:r>
+        <w:t>You can reuse this class back to back easily.</w:t>
+      </w:r>
+    </w:p>
+    <w:p>
+      <w:r>
+        <w:rPr>
+          <w:b/>
+          <w:bCs/>
+        </w:rPr>
+        <w:t>Model Context Protocol (MCP): a unified tool interface</w:t>
+      </w:r>
+      <w:r>
+        <w:rPr>
+          <w:b/>
+          <w:bCs/>
+        </w:rPr>
+        <w:t>(not clearly told on site, go for free MCP course)</w:t>
       </w:r>
     </w:p>
     <w:p/>
@@ -1437,6 +2373,119 @@
       </w:rPr>
     </w:lvl>
   </w:abstractNum>
+  <w:abstractNum w:abstractNumId="1" w15:restartNumberingAfterBreak="0">
+    <w:nsid w:val="7E96141D"/>
+    <w:multiLevelType w:val="hybridMultilevel"/>
+    <w:tmpl w:val="B5B68CC2"/>
+    <w:lvl w:ilvl="0" w:tplc="84C2AE0E">
+      <w:start w:val="1"/>
+      <w:numFmt w:val="bullet"/>
+      <w:lvlText w:val=""/>
+      <w:lvlJc w:val="left"/>
+      <w:pPr>
+        <w:ind w:left="720" w:hanging="360"/>
+      </w:pPr>
+      <w:rPr>
+        <w:rFonts w:ascii="Symbol" w:hAnsi="Symbol" w:hint="default"/>
+      </w:rPr>
+    </w:lvl>
+    <w:lvl w:ilvl="1" w:tplc="04090003" w:tentative="1">
+      <w:start w:val="1"/>
+      <w:numFmt w:val="bullet"/>
+      <w:lvlText w:val="o"/>
+      <w:lvlJc w:val="left"/>
+      <w:pPr>
+        <w:ind w:left="1440" w:hanging="360"/>
+      </w:pPr>
+      <w:rPr>
+        <w:rFonts w:ascii="Courier New" w:hAnsi="Courier New" w:cs="Courier New" w:hint="default"/>
+      </w:rPr>
+    </w:lvl>
+    <w:lvl w:ilvl="2" w:tplc="04090005" w:tentative="1">
+      <w:start w:val="1"/>
+      <w:numFmt w:val="bullet"/>
+      <w:lvlText w:val=""/>
+      <w:lvlJc w:val="left"/>
+      <w:pPr>
+        <w:ind w:left="2160" w:hanging="360"/>
+      </w:pPr>
+      <w:rPr>
+        <w:rFonts w:ascii="Wingdings" w:hAnsi="Wingdings" w:hint="default"/>
+      </w:rPr>
+    </w:lvl>
+    <w:lvl w:ilvl="3" w:tplc="04090001" w:tentative="1">
+      <w:start w:val="1"/>
+      <w:numFmt w:val="bullet"/>
+      <w:lvlText w:val=""/>
+      <w:lvlJc w:val="left"/>
+      <w:pPr>
+        <w:ind w:left="2880" w:hanging="360"/>
+      </w:pPr>
+      <w:rPr>
+        <w:rFonts w:ascii="Symbol" w:hAnsi="Symbol" w:hint="default"/>
+      </w:rPr>
+    </w:lvl>
+    <w:lvl w:ilvl="4" w:tplc="04090003" w:tentative="1">
+      <w:start w:val="1"/>
+      <w:numFmt w:val="bullet"/>
+      <w:lvlText w:val="o"/>
+      <w:lvlJc w:val="left"/>
+      <w:pPr>
+        <w:ind w:left="3600" w:hanging="360"/>
+      </w:pPr>
+      <w:rPr>
+        <w:rFonts w:ascii="Courier New" w:hAnsi="Courier New" w:cs="Courier New" w:hint="default"/>
+      </w:rPr>
+    </w:lvl>
+    <w:lvl w:ilvl="5" w:tplc="04090005" w:tentative="1">
+      <w:start w:val="1"/>
+      <w:numFmt w:val="bullet"/>
+      <w:lvlText w:val=""/>
+      <w:lvlJc w:val="left"/>
+      <w:pPr>
+        <w:ind w:left="4320" w:hanging="360"/>
+      </w:pPr>
+      <w:rPr>
+        <w:rFonts w:ascii="Wingdings" w:hAnsi="Wingdings" w:hint="default"/>
+      </w:rPr>
+    </w:lvl>
+    <w:lvl w:ilvl="6" w:tplc="04090001" w:tentative="1">
+      <w:start w:val="1"/>
+      <w:numFmt w:val="bullet"/>
+      <w:lvlText w:val=""/>
+      <w:lvlJc w:val="left"/>
+      <w:pPr>
+        <w:ind w:left="5040" w:hanging="360"/>
+      </w:pPr>
+      <w:rPr>
+        <w:rFonts w:ascii="Symbol" w:hAnsi="Symbol" w:hint="default"/>
+      </w:rPr>
+    </w:lvl>
+    <w:lvl w:ilvl="7" w:tplc="04090003" w:tentative="1">
+      <w:start w:val="1"/>
+      <w:numFmt w:val="bullet"/>
+      <w:lvlText w:val="o"/>
+      <w:lvlJc w:val="left"/>
+      <w:pPr>
+        <w:ind w:left="5760" w:hanging="360"/>
+      </w:pPr>
+      <w:rPr>
+        <w:rFonts w:ascii="Courier New" w:hAnsi="Courier New" w:cs="Courier New" w:hint="default"/>
+      </w:rPr>
+    </w:lvl>
+    <w:lvl w:ilvl="8" w:tplc="04090005" w:tentative="1">
+      <w:start w:val="1"/>
+      <w:numFmt w:val="bullet"/>
+      <w:lvlText w:val=""/>
+      <w:lvlJc w:val="left"/>
+      <w:pPr>
+        <w:ind w:left="6480" w:hanging="360"/>
+      </w:pPr>
+      <w:rPr>
+        <w:rFonts w:ascii="Wingdings" w:hAnsi="Wingdings" w:hint="default"/>
+      </w:rPr>
+    </w:lvl>
+  </w:abstractNum>
   <w:num w:numId="1" w16cid:durableId="1780098621">
     <w:abstractNumId w:val="0"/>
   </w:num>
@@ -1454,6 +2503,9 @@
   </w:num>
   <w:num w:numId="6" w16cid:durableId="1034428822">
     <w:abstractNumId w:val="0"/>
+  </w:num>
+  <w:num w:numId="7" w16cid:durableId="1312909922">
+    <w:abstractNumId w:val="1"/>
   </w:num>
 </w:numbering>
 </file>
@@ -1860,7 +2912,7 @@
   <w:style w:type="paragraph" w:default="1" w:styleId="Normal">
     <w:name w:val="Normal"/>
     <w:qFormat/>
-    <w:rsid w:val="00857614"/>
+    <w:rsid w:val="00E35D9E"/>
     <w:pPr>
       <w:spacing w:line="278" w:lineRule="auto"/>
       <w:ind w:firstLine="0"/>

</xml_diff>